<commit_message>
Programmes batch 4: AWS courses 16-21 (EN + FR)
Cold-read fixes: exam-domain gaps (CLF-C02 billing and support, SAA-C03 cost
optimisation), Security Hub CSPM naming, labs ordered after their topics,
named lab costs.

Co-Authored-By: Claude Opus 5.5 <noreply@anthropic.com>
</commit_message>
<xml_diff>
--- a/res/programmes/AWS-Cloud-Practitioner-33h-FR.docx
+++ b/res/programmes/AWS-Cloud-Practitioner-33h-FR.docx
@@ -212,7 +212,7 @@
         <w:pStyle w:val="ProgBody"/>
       </w:pPr>
       <w:r>
-        <w:t>Ce programme donne aux participants une connaissance pratique d’Amazon Web Services et prépare l’examen AWS Certified Cloud Practitioner (CLF-C02). Ils découvrent les modèles du cloud et la tarification AWS, sécurisent un compte avec IAM, puis utilisent les services essentiels : réseau avec VPC, Route 53 et CloudFront, calcul avec EC2, Lambda et les conteneurs, stockage, bases de données, mise à l’échelle et supervision, le tout guidé par le Well-Architected Framework. Chaque chapitre se termine par un TP dans la console ou la CLI AWS, un entraînement à l’examen clôt le contenu, et le programme s’achève par un projet final où les équipes déploient une application web hautement disponible et présentent son estimation de coût.</w:t>
+        <w:t>Ce programme donne aux participants une connaissance pratique d’Amazon Web Services et prépare l’examen AWS Certified Cloud Practitioner (CLF-C02). Ils découvrent les modèles du cloud et la tarification AWS, sécurisent un compte avec IAM, puis utilisent les services essentiels : réseau avec VPC, Route 53 et CloudFront, calcul avec EC2, Lambda et les conteneurs, stockage, bases de données, mise à l’échelle et supervision, le tout guidé par le Well-Architected Framework. Presque chaque chapitre se termine par un TP dans la console ou la CLI AWS, un entraînement à l’examen clôt le contenu, et le programme s’achève par un projet final où les équipes déploient une application web hautement disponible et présentent son estimation de coût.</w:t>
       </w:r>
     </w:p>
     <w:p>
@@ -893,7 +893,7 @@
         <w:pStyle w:val="ProgIntro"/>
       </w:pPr>
       <w:r>
-        <w:t>Les participants découvrent ce que le cloud change, comment AWS le facture et où il fonctionne, puis sécurisent leur compte de test : modèle de responsabilité partagée, utilisateurs, groupes, rôles et politiques IAM, et MFA. TP validé : un compte avec MFA sur l’utilisateur root, un groupe d’administrateurs, un rôle au moindre privilège et un budget avec alerte.</w:t>
+        <w:t>Les participants découvrent ce que le cloud change, comment AWS le facture et où il fonctionne, puis sécurisent leur compte de test : modèle de responsabilité partagée, utilisateurs, groupes, rôles et politiques IAM, et MFA. TP validé : un compte avec MFA pour chaque utilisateur, un groupe d’administrateurs, un rôle au moindre privilège et un budget avec alerte.</w:t>
       </w:r>
     </w:p>
     <w:tbl>
@@ -1082,7 +1082,7 @@
               <w:pStyle w:val="ProgTableText"/>
             </w:pPr>
             <w:r>
-              <w:t>Modèles de tarification, coût total de possession, facturation, Régions, zones de disponibilité, emplacements périphériques</w:t>
+              <w:t>Modèles de tarification, coût total de possession, facturation, AWS Budgets et Cost Explorer, facturation consolidée, plans de support, Régions, zones de disponibilité, emplacements périphériques</w:t>
             </w:r>
           </w:p>
         </w:tc>
@@ -1149,7 +1149,7 @@
               <w:pStyle w:val="ProgTableText"/>
             </w:pPr>
             <w:r>
-              <w:t>Responsabilité partagée, utilisateurs, groupes, rôles, politiques, MFA</w:t>
+              <w:t>Responsabilité partagée, utilisateurs, groupes, rôles, politiques, MFA, panorama des services de sécurité (GuardDuty, Inspector, Shield, WAF, AWS Artifact)</w:t>
             </w:r>
           </w:p>
         </w:tc>
@@ -1838,7 +1838,7 @@
               <w:pStyle w:val="ProgTableText"/>
             </w:pPr>
             <w:r>
-              <w:t>Questions d’entraînement et révision</w:t>
+              <w:t>Questions d’entraînement sur les quatre domaines ; révision des catégories de services non pratiquées en TP (analytique, IA/ML, migration)</w:t>
             </w:r>
           </w:p>
         </w:tc>

</xml_diff>